<commit_message>
corrected invoicenr into invoiceid
</commit_message>
<xml_diff>
--- a/public/dmr.docx
+++ b/public/dmr.docx
@@ -16,7 +16,23 @@
           <w:sz w:val="20"/>
           <w:szCs w:val="20"/>
         </w:rPr>
-        <w:t>[contactname]</w:t>
+        <w:t>[</w:t>
+      </w:r>
+      <w:proofErr w:type="spellStart"/>
+      <w:r>
+        <w:rPr>
+          <w:sz w:val="20"/>
+          <w:szCs w:val="20"/>
+        </w:rPr>
+        <w:t>contactname</w:t>
+      </w:r>
+      <w:proofErr w:type="spellEnd"/>
+      <w:r>
+        <w:rPr>
+          <w:sz w:val="20"/>
+          <w:szCs w:val="20"/>
+        </w:rPr>
+        <w:t>]</w:t>
       </w:r>
     </w:p>
     <w:p>
@@ -33,7 +49,23 @@
           <w:sz w:val="20"/>
           <w:szCs w:val="20"/>
         </w:rPr>
-        <w:t>[address]</w:t>
+        <w:t>[</w:t>
+      </w:r>
+      <w:proofErr w:type="spellStart"/>
+      <w:r>
+        <w:rPr>
+          <w:sz w:val="20"/>
+          <w:szCs w:val="20"/>
+        </w:rPr>
+        <w:t>address</w:t>
+      </w:r>
+      <w:proofErr w:type="spellEnd"/>
+      <w:r>
+        <w:rPr>
+          <w:sz w:val="20"/>
+          <w:szCs w:val="20"/>
+        </w:rPr>
+        <w:t>]</w:t>
       </w:r>
     </w:p>
     <w:p>
@@ -51,7 +83,23 @@
           <w:sz w:val="20"/>
           <w:szCs w:val="20"/>
         </w:rPr>
-        <w:t>[zipcity]</w:t>
+        <w:t>[</w:t>
+      </w:r>
+      <w:proofErr w:type="spellStart"/>
+      <w:r>
+        <w:rPr>
+          <w:sz w:val="20"/>
+          <w:szCs w:val="20"/>
+        </w:rPr>
+        <w:t>zipcity</w:t>
+      </w:r>
+      <w:proofErr w:type="spellEnd"/>
+      <w:r>
+        <w:rPr>
+          <w:sz w:val="20"/>
+          <w:szCs w:val="20"/>
+        </w:rPr>
+        <w:t>]</w:t>
       </w:r>
     </w:p>
     <w:p>
@@ -147,7 +195,25 @@
                                 <w:sz w:val="18"/>
                                 <w:szCs w:val="18"/>
                               </w:rPr>
-                              <w:t>[salesman]</w:t>
+                              <w:t>[</w:t>
+                            </w:r>
+                            <w:proofErr w:type="spellStart"/>
+                            <w:r>
+                              <w:rPr>
+                                <w:iCs/>
+                                <w:sz w:val="18"/>
+                                <w:szCs w:val="18"/>
+                              </w:rPr>
+                              <w:t>salesman</w:t>
+                            </w:r>
+                            <w:proofErr w:type="spellEnd"/>
+                            <w:r>
+                              <w:rPr>
+                                <w:iCs/>
+                                <w:sz w:val="18"/>
+                                <w:szCs w:val="18"/>
+                              </w:rPr>
+                              <w:t>]</w:t>
                             </w:r>
                           </w:p>
                           <w:p>
@@ -252,7 +318,7 @@
                                 <w:sz w:val="18"/>
                                 <w:szCs w:val="18"/>
                               </w:rPr>
-                              <w:t>[date]</w:t>
+                              <w:t>10.10.2025</w:t>
                             </w:r>
                             <w:r>
                               <w:rPr>
@@ -322,7 +388,25 @@
                           <w:sz w:val="18"/>
                           <w:szCs w:val="18"/>
                         </w:rPr>
-                        <w:t>[salesman]</w:t>
+                        <w:t>[</w:t>
+                      </w:r>
+                      <w:proofErr w:type="spellStart"/>
+                      <w:r>
+                        <w:rPr>
+                          <w:iCs/>
+                          <w:sz w:val="18"/>
+                          <w:szCs w:val="18"/>
+                        </w:rPr>
+                        <w:t>salesman</w:t>
+                      </w:r>
+                      <w:proofErr w:type="spellEnd"/>
+                      <w:r>
+                        <w:rPr>
+                          <w:iCs/>
+                          <w:sz w:val="18"/>
+                          <w:szCs w:val="18"/>
+                        </w:rPr>
+                        <w:t>]</w:t>
                       </w:r>
                     </w:p>
                     <w:p>
@@ -427,7 +511,7 @@
                           <w:sz w:val="18"/>
                           <w:szCs w:val="18"/>
                         </w:rPr>
-                        <w:t>[date]</w:t>
+                        <w:t>10.10.2025</w:t>
                       </w:r>
                       <w:r>
                         <w:rPr>
@@ -543,7 +627,27 @@
           <w:sz w:val="20"/>
           <w:szCs w:val="20"/>
         </w:rPr>
-        <w:t>[timestart]</w:t>
+        <w:t>[</w:t>
+      </w:r>
+      <w:proofErr w:type="spellStart"/>
+      <w:r>
+        <w:rPr>
+          <w:b/>
+          <w:bCs/>
+          <w:sz w:val="20"/>
+          <w:szCs w:val="20"/>
+        </w:rPr>
+        <w:t>timestart</w:t>
+      </w:r>
+      <w:proofErr w:type="spellEnd"/>
+      <w:r>
+        <w:rPr>
+          <w:b/>
+          <w:bCs/>
+          <w:sz w:val="20"/>
+          <w:szCs w:val="20"/>
+        </w:rPr>
+        <w:t>]</w:t>
       </w:r>
     </w:p>
     <w:p>
@@ -586,7 +690,25 @@
           <w:sz w:val="20"/>
           <w:szCs w:val="20"/>
         </w:rPr>
-        <w:t>[totaladdress]</w:t>
+        <w:t>[</w:t>
+      </w:r>
+      <w:proofErr w:type="spellStart"/>
+      <w:r>
+        <w:rPr>
+          <w:bCs/>
+          <w:sz w:val="20"/>
+          <w:szCs w:val="20"/>
+        </w:rPr>
+        <w:t>totaladdress</w:t>
+      </w:r>
+      <w:proofErr w:type="spellEnd"/>
+      <w:r>
+        <w:rPr>
+          <w:bCs/>
+          <w:sz w:val="20"/>
+          <w:szCs w:val="20"/>
+        </w:rPr>
+        <w:t>]</w:t>
       </w:r>
     </w:p>
     <w:p>
@@ -599,20 +721,30 @@
           <w:szCs w:val="20"/>
         </w:rPr>
       </w:pPr>
+      <w:proofErr w:type="spellStart"/>
       <w:r>
         <w:rPr>
           <w:bCs/>
           <w:sz w:val="20"/>
           <w:szCs w:val="20"/>
         </w:rPr>
-        <w:t>USt-ID</w:t>
-      </w:r>
+        <w:t>USt</w:t>
+      </w:r>
+      <w:proofErr w:type="spellEnd"/>
       <w:r>
         <w:rPr>
           <w:bCs/>
           <w:sz w:val="20"/>
           <w:szCs w:val="20"/>
         </w:rPr>
+        <w:t>-ID</w:t>
+      </w:r>
+      <w:r>
+        <w:rPr>
+          <w:bCs/>
+          <w:sz w:val="20"/>
+          <w:szCs w:val="20"/>
+        </w:rPr>
         <w:t>:</w:t>
       </w:r>
       <w:r>
@@ -645,7 +777,25 @@
           <w:sz w:val="20"/>
           <w:szCs w:val="20"/>
         </w:rPr>
-        <w:t>[ustid]</w:t>
+        <w:t>[</w:t>
+      </w:r>
+      <w:proofErr w:type="spellStart"/>
+      <w:r>
+        <w:rPr>
+          <w:bCs/>
+          <w:sz w:val="20"/>
+          <w:szCs w:val="20"/>
+        </w:rPr>
+        <w:t>ustid</w:t>
+      </w:r>
+      <w:proofErr w:type="spellEnd"/>
+      <w:r>
+        <w:rPr>
+          <w:bCs/>
+          <w:sz w:val="20"/>
+          <w:szCs w:val="20"/>
+        </w:rPr>
+        <w:t>]</w:t>
       </w:r>
       <w:r>
         <w:rPr>
@@ -696,7 +846,25 @@
           <w:sz w:val="20"/>
           <w:szCs w:val="20"/>
         </w:rPr>
-        <w:t>[tenancyunit]</w:t>
+        <w:t>[</w:t>
+      </w:r>
+      <w:proofErr w:type="spellStart"/>
+      <w:r>
+        <w:rPr>
+          <w:bCs/>
+          <w:sz w:val="20"/>
+          <w:szCs w:val="20"/>
+        </w:rPr>
+        <w:t>tenancyunit</w:t>
+      </w:r>
+      <w:proofErr w:type="spellEnd"/>
+      <w:r>
+        <w:rPr>
+          <w:bCs/>
+          <w:sz w:val="20"/>
+          <w:szCs w:val="20"/>
+        </w:rPr>
+        <w:t>]</w:t>
       </w:r>
     </w:p>
     <w:p>
@@ -754,7 +922,33 @@
           <w:sz w:val="20"/>
           <w:szCs w:val="20"/>
         </w:rPr>
-        <w:t>[invoicenr]</w:t>
+        <w:t>[</w:t>
+      </w:r>
+      <w:proofErr w:type="spellStart"/>
+      <w:r>
+        <w:rPr>
+          <w:bCs/>
+          <w:sz w:val="20"/>
+          <w:szCs w:val="20"/>
+        </w:rPr>
+        <w:t>invoice</w:t>
+      </w:r>
+      <w:r>
+        <w:rPr>
+          <w:bCs/>
+          <w:sz w:val="20"/>
+          <w:szCs w:val="20"/>
+        </w:rPr>
+        <w:t>id</w:t>
+      </w:r>
+      <w:proofErr w:type="spellEnd"/>
+      <w:r>
+        <w:rPr>
+          <w:bCs/>
+          <w:sz w:val="20"/>
+          <w:szCs w:val="20"/>
+        </w:rPr>
+        <w:t>]</w:t>
       </w:r>
     </w:p>
     <w:p>
@@ -824,6 +1018,7 @@
         </w:rPr>
         <w:t>[</w:t>
       </w:r>
+      <w:proofErr w:type="spellStart"/>
       <w:r>
         <w:rPr>
           <w:sz w:val="20"/>
@@ -836,7 +1031,15 @@
           <w:sz w:val="20"/>
           <w:szCs w:val="20"/>
         </w:rPr>
-        <w:t>id]</w:t>
+        <w:t>id</w:t>
+      </w:r>
+      <w:proofErr w:type="spellEnd"/>
+      <w:r>
+        <w:rPr>
+          <w:sz w:val="20"/>
+          <w:szCs w:val="20"/>
+        </w:rPr>
+        <w:t>]</w:t>
       </w:r>
       <w:r>
         <w:rPr>
@@ -850,7 +1053,23 @@
           <w:sz w:val="20"/>
           <w:szCs w:val="20"/>
         </w:rPr>
-        <w:t>[entityaddress]</w:t>
+        <w:t>[</w:t>
+      </w:r>
+      <w:proofErr w:type="spellStart"/>
+      <w:r>
+        <w:rPr>
+          <w:sz w:val="20"/>
+          <w:szCs w:val="20"/>
+        </w:rPr>
+        <w:t>entityaddress</w:t>
+      </w:r>
+      <w:proofErr w:type="spellEnd"/>
+      <w:r>
+        <w:rPr>
+          <w:sz w:val="20"/>
+          <w:szCs w:val="20"/>
+        </w:rPr>
+        <w:t>]</w:t>
       </w:r>
       <w:r>
         <w:rPr>
@@ -963,7 +1182,15 @@
                 <w:sz w:val="20"/>
                 <w:szCs w:val="20"/>
               </w:rPr>
-              <w:t>[curren</w:t>
+              <w:t>[</w:t>
+            </w:r>
+            <w:proofErr w:type="spellStart"/>
+            <w:r>
+              <w:rPr>
+                <w:sz w:val="20"/>
+                <w:szCs w:val="20"/>
+              </w:rPr>
+              <w:t>curren</w:t>
             </w:r>
             <w:r>
               <w:rPr>
@@ -972,6 +1199,7 @@
               </w:rPr>
               <w:t>trent</w:t>
             </w:r>
+            <w:proofErr w:type="spellEnd"/>
             <w:r>
               <w:rPr>
                 <w:sz w:val="20"/>
@@ -995,7 +1223,23 @@
                 <w:sz w:val="20"/>
                 <w:szCs w:val="20"/>
               </w:rPr>
-              <w:t>[tax] EUR</w:t>
+              <w:t>[</w:t>
+            </w:r>
+            <w:proofErr w:type="spellStart"/>
+            <w:r>
+              <w:rPr>
+                <w:sz w:val="20"/>
+                <w:szCs w:val="20"/>
+              </w:rPr>
+              <w:t>tax</w:t>
+            </w:r>
+            <w:proofErr w:type="spellEnd"/>
+            <w:r>
+              <w:rPr>
+                <w:sz w:val="20"/>
+                <w:szCs w:val="20"/>
+              </w:rPr>
+              <w:t>] EUR</w:t>
             </w:r>
           </w:p>
         </w:tc>
@@ -1100,14 +1344,23 @@
                 <w:sz w:val="20"/>
                 <w:szCs w:val="20"/>
               </w:rPr>
-              <w:t>zzgl. MwSt. (</w:t>
+              <w:t>zzgl. MwSt. ([</w:t>
             </w:r>
+            <w:proofErr w:type="spellStart"/>
             <w:r>
               <w:rPr>
                 <w:sz w:val="20"/>
                 <w:szCs w:val="20"/>
               </w:rPr>
-              <w:t>[taxpct])</w:t>
+              <w:t>taxpct</w:t>
+            </w:r>
+            <w:proofErr w:type="spellEnd"/>
+            <w:r>
+              <w:rPr>
+                <w:sz w:val="20"/>
+                <w:szCs w:val="20"/>
+              </w:rPr>
+              <w:t>])</w:t>
             </w:r>
           </w:p>
         </w:tc>
@@ -1133,7 +1386,23 @@
                 <w:sz w:val="20"/>
                 <w:szCs w:val="20"/>
               </w:rPr>
-              <w:t>[currentneben] EUR</w:t>
+              <w:t>[</w:t>
+            </w:r>
+            <w:proofErr w:type="spellStart"/>
+            <w:r>
+              <w:rPr>
+                <w:sz w:val="20"/>
+                <w:szCs w:val="20"/>
+              </w:rPr>
+              <w:t>currentneben</w:t>
+            </w:r>
+            <w:proofErr w:type="spellEnd"/>
+            <w:r>
+              <w:rPr>
+                <w:sz w:val="20"/>
+                <w:szCs w:val="20"/>
+              </w:rPr>
+              <w:t>] EUR</w:t>
             </w:r>
           </w:p>
           <w:p>
@@ -1151,7 +1420,23 @@
                 <w:sz w:val="20"/>
                 <w:szCs w:val="20"/>
               </w:rPr>
-              <w:t>[taxneben] EUR</w:t>
+              <w:t>[</w:t>
+            </w:r>
+            <w:proofErr w:type="spellStart"/>
+            <w:r>
+              <w:rPr>
+                <w:sz w:val="20"/>
+                <w:szCs w:val="20"/>
+              </w:rPr>
+              <w:t>taxneben</w:t>
+            </w:r>
+            <w:proofErr w:type="spellEnd"/>
+            <w:r>
+              <w:rPr>
+                <w:sz w:val="20"/>
+                <w:szCs w:val="20"/>
+              </w:rPr>
+              <w:t>] EUR</w:t>
             </w:r>
           </w:p>
         </w:tc>
@@ -1269,7 +1554,27 @@
                 <w:sz w:val="20"/>
                 <w:szCs w:val="20"/>
               </w:rPr>
-              <w:t>[totalrent]</w:t>
+              <w:t>[</w:t>
+            </w:r>
+            <w:proofErr w:type="spellStart"/>
+            <w:r>
+              <w:rPr>
+                <w:b/>
+                <w:bCs/>
+                <w:sz w:val="20"/>
+                <w:szCs w:val="20"/>
+              </w:rPr>
+              <w:t>totalrent</w:t>
+            </w:r>
+            <w:proofErr w:type="spellEnd"/>
+            <w:r>
+              <w:rPr>
+                <w:b/>
+                <w:bCs/>
+                <w:sz w:val="20"/>
+                <w:szCs w:val="20"/>
+              </w:rPr>
+              <w:t>]</w:t>
             </w:r>
             <w:r>
               <w:rPr>
@@ -1496,7 +1801,23 @@
           <w:sz w:val="20"/>
           <w:szCs w:val="20"/>
         </w:rPr>
-        <w:t>[entityid]</w:t>
+        <w:t>[</w:t>
+      </w:r>
+      <w:proofErr w:type="spellStart"/>
+      <w:r>
+        <w:rPr>
+          <w:sz w:val="20"/>
+          <w:szCs w:val="20"/>
+        </w:rPr>
+        <w:t>entityid</w:t>
+      </w:r>
+      <w:proofErr w:type="spellEnd"/>
+      <w:r>
+        <w:rPr>
+          <w:sz w:val="20"/>
+          <w:szCs w:val="20"/>
+        </w:rPr>
+        <w:t>]</w:t>
       </w:r>
     </w:p>
     <w:p>
@@ -1506,14 +1827,12 @@
         <w:rPr>
           <w:sz w:val="20"/>
           <w:szCs w:val="20"/>
-          <w:lang w:val="en-US"/>
         </w:rPr>
       </w:pPr>
       <w:r>
         <w:rPr>
           <w:sz w:val="20"/>
           <w:szCs w:val="20"/>
-          <w:lang w:val="en-US"/>
         </w:rPr>
         <w:t>IBAN: LU09 0340 0002 0584 6948</w:t>
       </w:r>
@@ -1525,14 +1844,12 @@
         <w:rPr>
           <w:sz w:val="20"/>
           <w:szCs w:val="20"/>
-          <w:lang w:val="en-US"/>
         </w:rPr>
       </w:pPr>
       <w:r>
         <w:rPr>
           <w:sz w:val="20"/>
           <w:szCs w:val="20"/>
-          <w:lang w:val="en-US"/>
         </w:rPr>
         <w:t>BIC: CITILULX</w:t>
       </w:r>
@@ -1544,14 +1861,12 @@
         <w:rPr>
           <w:sz w:val="20"/>
           <w:szCs w:val="20"/>
-          <w:lang w:val="en-US"/>
         </w:rPr>
       </w:pPr>
       <w:r>
         <w:rPr>
           <w:sz w:val="20"/>
           <w:szCs w:val="20"/>
-          <w:lang w:val="en-US"/>
         </w:rPr>
         <w:t>Bank: Citi Bank</w:t>
       </w:r>
@@ -1563,7 +1878,6 @@
         <w:rPr>
           <w:sz w:val="20"/>
           <w:szCs w:val="20"/>
-          <w:lang w:val="en-US"/>
         </w:rPr>
       </w:pPr>
     </w:p>
@@ -2124,9 +2438,11 @@
                             </w:rPr>
                             <w:t xml:space="preserve"> </w:t>
                           </w:r>
+                          <w:proofErr w:type="spellStart"/>
                           <w:r>
                             <w:t>redefinieren</w:t>
                           </w:r>
+                          <w:proofErr w:type="spellEnd"/>
                           <w:r>
                             <w:rPr>
                               <w:spacing w:val="-9"/>
@@ -2221,9 +2537,11 @@
                       </w:rPr>
                       <w:t xml:space="preserve"> </w:t>
                     </w:r>
+                    <w:proofErr w:type="spellStart"/>
                     <w:r>
                       <w:t>redefinieren</w:t>
                     </w:r>
+                    <w:proofErr w:type="spellEnd"/>
                     <w:r>
                       <w:rPr>
                         <w:spacing w:val="-9"/>
@@ -2386,13 +2704,23 @@
                             </w:rPr>
                             <w:br/>
                           </w:r>
+                          <w:proofErr w:type="spellStart"/>
                           <w:r>
                             <w:rPr>
                               <w:color w:val="D59B5E"/>
                               <w:spacing w:val="-2"/>
                               <w:sz w:val="16"/>
                             </w:rPr>
-                            <w:t>USt-ID</w:t>
+                            <w:t>USt</w:t>
+                          </w:r>
+                          <w:proofErr w:type="spellEnd"/>
+                          <w:r>
+                            <w:rPr>
+                              <w:color w:val="D59B5E"/>
+                              <w:spacing w:val="-2"/>
+                              <w:sz w:val="16"/>
+                            </w:rPr>
+                            <w:t>-ID</w:t>
                           </w:r>
                           <w:r>
                             <w:rPr>
@@ -2553,13 +2881,23 @@
                       </w:rPr>
                       <w:br/>
                     </w:r>
+                    <w:proofErr w:type="spellStart"/>
                     <w:r>
                       <w:rPr>
                         <w:color w:val="D59B5E"/>
                         <w:spacing w:val="-2"/>
                         <w:sz w:val="16"/>
                       </w:rPr>
-                      <w:t>USt-ID</w:t>
+                      <w:t>USt</w:t>
+                    </w:r>
+                    <w:proofErr w:type="spellEnd"/>
+                    <w:r>
+                      <w:rPr>
+                        <w:color w:val="D59B5E"/>
+                        <w:spacing w:val="-2"/>
+                        <w:sz w:val="16"/>
+                      </w:rPr>
+                      <w:t>-ID</w:t>
                     </w:r>
                     <w:r>
                       <w:rPr>
@@ -2821,6 +3159,7 @@
                             </w:rPr>
                             <w:tab/>
                           </w:r>
+                          <w:proofErr w:type="spellStart"/>
                           <w:r>
                             <w:rPr>
                               <w:color w:val="D59B5E"/>
@@ -2829,6 +3168,7 @@
                             </w:rPr>
                             <w:t>TaunusTurm</w:t>
                           </w:r>
+                          <w:proofErr w:type="spellEnd"/>
                           <w:r>
                             <w:rPr>
                               <w:color w:val="D59B5E"/>
@@ -3139,13 +3479,23 @@
                             </w:rPr>
                             <w:t xml:space="preserve"> </w:t>
                           </w:r>
+                          <w:proofErr w:type="spellStart"/>
                           <w:r>
                             <w:rPr>
                               <w:color w:val="D59B5E"/>
                               <w:spacing w:val="-2"/>
                               <w:sz w:val="16"/>
                             </w:rPr>
-                            <w:t>USt-ID</w:t>
+                            <w:t>USt</w:t>
+                          </w:r>
+                          <w:proofErr w:type="spellEnd"/>
+                          <w:r>
+                            <w:rPr>
+                              <w:color w:val="D59B5E"/>
+                              <w:spacing w:val="-2"/>
+                              <w:sz w:val="16"/>
+                            </w:rPr>
+                            <w:t>-ID</w:t>
                           </w:r>
                           <w:r>
                             <w:rPr>
@@ -3219,9 +3569,11 @@
                             </w:rPr>
                             <w:t xml:space="preserve"> </w:t>
                           </w:r>
+                          <w:proofErr w:type="spellStart"/>
                           <w:r>
                             <w:t>redefinieren</w:t>
                           </w:r>
+                          <w:proofErr w:type="spellEnd"/>
                           <w:r>
                             <w:rPr>
                               <w:spacing w:val="-9"/>
@@ -3244,7 +3596,21 @@
                             <w:rPr>
                               <w:spacing w:val="-2"/>
                             </w:rPr>
-                            <w:t xml:space="preserve"> management.</w:t>
+                            <w:t xml:space="preserve"> </w:t>
+                          </w:r>
+                          <w:proofErr w:type="spellStart"/>
+                          <w:r>
+                            <w:rPr>
+                              <w:spacing w:val="-2"/>
+                            </w:rPr>
+                            <w:t>management</w:t>
+                          </w:r>
+                          <w:proofErr w:type="spellEnd"/>
+                          <w:r>
+                            <w:rPr>
+                              <w:spacing w:val="-2"/>
+                            </w:rPr>
+                            <w:t>.</w:t>
                           </w:r>
                         </w:p>
                         <w:p>
@@ -3435,6 +3801,7 @@
                       </w:rPr>
                       <w:tab/>
                     </w:r>
+                    <w:proofErr w:type="spellStart"/>
                     <w:r>
                       <w:rPr>
                         <w:color w:val="D59B5E"/>
@@ -3443,6 +3810,7 @@
                       </w:rPr>
                       <w:t>TaunusTurm</w:t>
                     </w:r>
+                    <w:proofErr w:type="spellEnd"/>
                     <w:r>
                       <w:rPr>
                         <w:color w:val="D59B5E"/>
@@ -3753,13 +4121,23 @@
                       </w:rPr>
                       <w:t xml:space="preserve"> </w:t>
                     </w:r>
+                    <w:proofErr w:type="spellStart"/>
                     <w:r>
                       <w:rPr>
                         <w:color w:val="D59B5E"/>
                         <w:spacing w:val="-2"/>
                         <w:sz w:val="16"/>
                       </w:rPr>
-                      <w:t>USt-ID</w:t>
+                      <w:t>USt</w:t>
+                    </w:r>
+                    <w:proofErr w:type="spellEnd"/>
+                    <w:r>
+                      <w:rPr>
+                        <w:color w:val="D59B5E"/>
+                        <w:spacing w:val="-2"/>
+                        <w:sz w:val="16"/>
+                      </w:rPr>
+                      <w:t>-ID</w:t>
                     </w:r>
                     <w:r>
                       <w:rPr>
@@ -3833,9 +4211,11 @@
                       </w:rPr>
                       <w:t xml:space="preserve"> </w:t>
                     </w:r>
+                    <w:proofErr w:type="spellStart"/>
                     <w:r>
                       <w:t>redefinieren</w:t>
                     </w:r>
+                    <w:proofErr w:type="spellEnd"/>
                     <w:r>
                       <w:rPr>
                         <w:spacing w:val="-9"/>
@@ -3858,7 +4238,21 @@
                       <w:rPr>
                         <w:spacing w:val="-2"/>
                       </w:rPr>
-                      <w:t xml:space="preserve"> management.</w:t>
+                      <w:t xml:space="preserve"> </w:t>
+                    </w:r>
+                    <w:proofErr w:type="spellStart"/>
+                    <w:r>
+                      <w:rPr>
+                        <w:spacing w:val="-2"/>
+                      </w:rPr>
+                      <w:t>management</w:t>
+                    </w:r>
+                    <w:proofErr w:type="spellEnd"/>
+                    <w:r>
+                      <w:rPr>
+                        <w:spacing w:val="-2"/>
+                      </w:rPr>
+                      <w:t>.</w:t>
                     </w:r>
                   </w:p>
                   <w:p>
@@ -5467,10 +5861,26 @@
 </file>
 
 <file path=customXml/item1.xml><?xml version="1.0" encoding="utf-8"?>
-<b:Sources xmlns:b="http://schemas.openxmlformats.org/officeDocument/2006/bibliography" xmlns="http://schemas.openxmlformats.org/officeDocument/2006/bibliography" SelectedStyle="/APASixthEditionOfficeOnline.xsl" StyleName="APA" Version="6"/>
+<p:properties xmlns:p="http://schemas.microsoft.com/office/2006/metadata/properties" xmlns:xsi="http://www.w3.org/2001/XMLSchema-instance" xmlns:pc="http://schemas.microsoft.com/office/infopath/2007/PartnerControls">
+  <documentManagement>
+    <TaxCatchAll xmlns="10c51629-9d4e-44b7-9242-5dd18297b802" xsi:nil="true"/>
+    <lcf76f155ced4ddcb4097134ff3c332f xmlns="d47ff7e4-d462-445f-8a6f-6980df6881ac">
+      <Terms xmlns="http://schemas.microsoft.com/office/infopath/2007/PartnerControls"/>
+    </lcf76f155ced4ddcb4097134ff3c332f>
+  </documentManagement>
+</p:properties>
 </file>
 
 <file path=customXml/item2.xml><?xml version="1.0" encoding="utf-8"?>
+<?mso-contentType ?>
+<FormTemplates xmlns="http://schemas.microsoft.com/sharepoint/v3/contenttype/forms">
+  <Display>DocumentLibraryForm</Display>
+  <Edit>DocumentLibraryForm</Edit>
+  <New>DocumentLibraryForm</New>
+</FormTemplates>
+</file>
+
+<file path=customXml/item3.xml><?xml version="1.0" encoding="utf-8"?>
 <ct:contentTypeSchema xmlns:ct="http://schemas.microsoft.com/office/2006/metadata/contentType" xmlns:ma="http://schemas.microsoft.com/office/2006/metadata/properties/metaAttributes" ct:_="" ma:_="" ma:contentTypeName="Dokument" ma:contentTypeID="0x010100874734504954F544BC428EE16C89FD01" ma:contentTypeVersion="15" ma:contentTypeDescription="Ein neues Dokument erstellen." ma:contentTypeScope="" ma:versionID="3c3d4a59f79bb6bbe2f74cc6b53a13d1">
   <xsd:schema xmlns:xsd="http://www.w3.org/2001/XMLSchema" xmlns:xs="http://www.w3.org/2001/XMLSchema" xmlns:p="http://schemas.microsoft.com/office/2006/metadata/properties" xmlns:ns2="d47ff7e4-d462-445f-8a6f-6980df6881ac" xmlns:ns3="10c51629-9d4e-44b7-9242-5dd18297b802" targetNamespace="http://schemas.microsoft.com/office/2006/metadata/properties" ma:root="true" ma:fieldsID="46717f953fb893f7dd8578ae7853de22" ns2:_="" ns3:_="">
     <xsd:import namespace="d47ff7e4-d462-445f-8a6f-6980df6881ac"/>
@@ -5705,35 +6115,30 @@
 </ct:contentTypeSchema>
 </file>
 
-<file path=customXml/item3.xml><?xml version="1.0" encoding="utf-8"?>
-<?mso-contentType ?>
-<FormTemplates xmlns="http://schemas.microsoft.com/sharepoint/v3/contenttype/forms">
-  <Display>DocumentLibraryForm</Display>
-  <Edit>DocumentLibraryForm</Edit>
-  <New>DocumentLibraryForm</New>
-</FormTemplates>
-</file>
-
 <file path=customXml/item4.xml><?xml version="1.0" encoding="utf-8"?>
-<p:properties xmlns:p="http://schemas.microsoft.com/office/2006/metadata/properties" xmlns:xsi="http://www.w3.org/2001/XMLSchema-instance" xmlns:pc="http://schemas.microsoft.com/office/infopath/2007/PartnerControls">
-  <documentManagement>
-    <TaxCatchAll xmlns="10c51629-9d4e-44b7-9242-5dd18297b802" xsi:nil="true"/>
-    <lcf76f155ced4ddcb4097134ff3c332f xmlns="d47ff7e4-d462-445f-8a6f-6980df6881ac">
-      <Terms xmlns="http://schemas.microsoft.com/office/infopath/2007/PartnerControls"/>
-    </lcf76f155ced4ddcb4097134ff3c332f>
-  </documentManagement>
-</p:properties>
+<b:Sources xmlns:b="http://schemas.openxmlformats.org/officeDocument/2006/bibliography" xmlns="http://schemas.openxmlformats.org/officeDocument/2006/bibliography" SelectedStyle="/APASixthEditionOfficeOnline.xsl" StyleName="APA" Version="6"/>
 </file>
 
 <file path=customXml/itemProps1.xml><?xml version="1.0" encoding="utf-8"?>
-<ds:datastoreItem xmlns:ds="http://schemas.openxmlformats.org/officeDocument/2006/customXml" ds:itemID="{4549AE6B-83C3-524F-BD17-7E0EE751D33E}">
+<ds:datastoreItem xmlns:ds="http://schemas.openxmlformats.org/officeDocument/2006/customXml" ds:itemID="{852F1A13-57C3-4B9F-9226-B1FC77FB594F}">
   <ds:schemaRefs>
-    <ds:schemaRef ds:uri="http://schemas.openxmlformats.org/officeDocument/2006/bibliography"/>
+    <ds:schemaRef ds:uri="http://schemas.microsoft.com/office/2006/metadata/properties"/>
+    <ds:schemaRef ds:uri="http://schemas.microsoft.com/office/infopath/2007/PartnerControls"/>
+    <ds:schemaRef ds:uri="10c51629-9d4e-44b7-9242-5dd18297b802"/>
+    <ds:schemaRef ds:uri="d47ff7e4-d462-445f-8a6f-6980df6881ac"/>
   </ds:schemaRefs>
 </ds:datastoreItem>
 </file>
 
 <file path=customXml/itemProps2.xml><?xml version="1.0" encoding="utf-8"?>
+<ds:datastoreItem xmlns:ds="http://schemas.openxmlformats.org/officeDocument/2006/customXml" ds:itemID="{3C344823-39CB-4398-8A5E-0309C578C2F1}">
+  <ds:schemaRefs>
+    <ds:schemaRef ds:uri="http://schemas.microsoft.com/sharepoint/v3/contenttype/forms"/>
+  </ds:schemaRefs>
+</ds:datastoreItem>
+</file>
+
+<file path=customXml/itemProps3.xml><?xml version="1.0" encoding="utf-8"?>
 <ds:datastoreItem xmlns:ds="http://schemas.openxmlformats.org/officeDocument/2006/customXml" ds:itemID="{2F7A64B1-7AA4-4F0E-B74D-A853C523C1E9}">
   <ds:schemaRefs>
     <ds:schemaRef ds:uri="http://schemas.microsoft.com/office/2006/metadata/contentType"/>
@@ -5752,21 +6157,10 @@
 </ds:datastoreItem>
 </file>
 
-<file path=customXml/itemProps3.xml><?xml version="1.0" encoding="utf-8"?>
-<ds:datastoreItem xmlns:ds="http://schemas.openxmlformats.org/officeDocument/2006/customXml" ds:itemID="{3C344823-39CB-4398-8A5E-0309C578C2F1}">
+<file path=customXml/itemProps4.xml><?xml version="1.0" encoding="utf-8"?>
+<ds:datastoreItem xmlns:ds="http://schemas.openxmlformats.org/officeDocument/2006/customXml" ds:itemID="{4549AE6B-83C3-524F-BD17-7E0EE751D33E}">
   <ds:schemaRefs>
-    <ds:schemaRef ds:uri="http://schemas.microsoft.com/sharepoint/v3/contenttype/forms"/>
-  </ds:schemaRefs>
-</ds:datastoreItem>
-</file>
-
-<file path=customXml/itemProps4.xml><?xml version="1.0" encoding="utf-8"?>
-<ds:datastoreItem xmlns:ds="http://schemas.openxmlformats.org/officeDocument/2006/customXml" ds:itemID="{852F1A13-57C3-4B9F-9226-B1FC77FB594F}">
-  <ds:schemaRefs>
-    <ds:schemaRef ds:uri="http://schemas.microsoft.com/office/2006/metadata/properties"/>
-    <ds:schemaRef ds:uri="http://schemas.microsoft.com/office/infopath/2007/PartnerControls"/>
-    <ds:schemaRef ds:uri="10c51629-9d4e-44b7-9242-5dd18297b802"/>
-    <ds:schemaRef ds:uri="d47ff7e4-d462-445f-8a6f-6980df6881ac"/>
+    <ds:schemaRef ds:uri="http://schemas.openxmlformats.org/officeDocument/2006/bibliography"/>
   </ds:schemaRefs>
 </ds:datastoreItem>
 </file>
</xml_diff>